<commit_message>
finished draft to go to innovation and aging. will send to Susanne and co-authors soon.
</commit_message>
<xml_diff>
--- a/paper/word/innovation_aging/main_document_innovation-in-aging.docx
+++ b/paper/word/innovation_aging/main_document_innovation-in-aging.docx
@@ -23795,7 +23795,7 @@
                 <w:sz w:val="18"/>
                 <w:lang w:val="en-US"/>
               </w:rPr>
-              <w:t>MWTP</w:t>
+              <w:t>MWTP (95% CI)</w:t>
             </w:r>
           </w:p>
         </w:tc>
@@ -23857,7 +23857,7 @@
                 <w:sz w:val="18"/>
                 <w:lang w:val="en-US"/>
               </w:rPr>
-              <w:t>MWTP</w:t>
+              <w:t>MWTP (95% CI)</w:t>
             </w:r>
           </w:p>
         </w:tc>
@@ -23919,7 +23919,7 @@
                 <w:sz w:val="18"/>
                 <w:lang w:val="en-US"/>
               </w:rPr>
-              <w:t>MWTP</w:t>
+              <w:t>MWTP (95% CI)</w:t>
             </w:r>
           </w:p>
         </w:tc>
@@ -23981,7 +23981,7 @@
                 <w:sz w:val="18"/>
                 <w:lang w:val="en-US"/>
               </w:rPr>
-              <w:t>MWTP</w:t>
+              <w:t>MWTP (95% CI)</w:t>
             </w:r>
           </w:p>
         </w:tc>
@@ -24074,6 +24074,15 @@
                 <w:lang w:val="en-US"/>
               </w:rPr>
               <w:t>-35</w:t>
+              <w:br/>
+            </w:r>
+            <w:r>
+              <w:rPr>
+                <w:rFonts w:ascii="Times New Roman" w:hAnsi="Times New Roman"/>
+                <w:sz w:val="18"/>
+                <w:lang w:val="en-US"/>
+              </w:rPr>
+              <w:t>(-138, 68)</w:t>
             </w:r>
           </w:p>
         </w:tc>
@@ -24134,6 +24143,15 @@
                 <w:lang w:val="en-US"/>
               </w:rPr>
               <w:t>593</w:t>
+              <w:br/>
+            </w:r>
+            <w:r>
+              <w:rPr>
+                <w:rFonts w:ascii="Times New Roman" w:hAnsi="Times New Roman"/>
+                <w:sz w:val="18"/>
+                <w:lang w:val="en-US"/>
+              </w:rPr>
+              <w:t>(373, 813)</w:t>
             </w:r>
           </w:p>
         </w:tc>
@@ -24194,6 +24212,15 @@
                 <w:lang w:val="en-US"/>
               </w:rPr>
               <w:t>8</w:t>
+              <w:br/>
+            </w:r>
+            <w:r>
+              <w:rPr>
+                <w:rFonts w:ascii="Times New Roman" w:hAnsi="Times New Roman"/>
+                <w:sz w:val="18"/>
+                <w:lang w:val="en-US"/>
+              </w:rPr>
+              <w:t>(-23, 39)</w:t>
             </w:r>
           </w:p>
         </w:tc>
@@ -24254,6 +24281,15 @@
                 <w:lang w:val="en-US"/>
               </w:rPr>
               <w:t>244</w:t>
+              <w:br/>
+            </w:r>
+            <w:r>
+              <w:rPr>
+                <w:rFonts w:ascii="Times New Roman" w:hAnsi="Times New Roman"/>
+                <w:sz w:val="18"/>
+                <w:lang w:val="en-US"/>
+              </w:rPr>
+              <w:t>(165, 323)</w:t>
             </w:r>
           </w:p>
         </w:tc>
@@ -24542,6 +24578,15 @@
                 <w:lang w:val="en-US"/>
               </w:rPr>
               <w:t>246</w:t>
+              <w:br/>
+            </w:r>
+            <w:r>
+              <w:rPr>
+                <w:rFonts w:ascii="Times New Roman" w:hAnsi="Times New Roman"/>
+                <w:sz w:val="18"/>
+                <w:lang w:val="en-US"/>
+              </w:rPr>
+              <w:t>(103, 389)</w:t>
             </w:r>
           </w:p>
         </w:tc>
@@ -24596,6 +24641,15 @@
                 <w:lang w:val="en-US"/>
               </w:rPr>
               <w:t>1070</w:t>
+              <w:br/>
+            </w:r>
+            <w:r>
+              <w:rPr>
+                <w:rFonts w:ascii="Times New Roman" w:hAnsi="Times New Roman"/>
+                <w:sz w:val="18"/>
+                <w:lang w:val="en-US"/>
+              </w:rPr>
+              <w:t>(684, 1456)</w:t>
             </w:r>
           </w:p>
         </w:tc>
@@ -24650,6 +24704,15 @@
                 <w:lang w:val="en-US"/>
               </w:rPr>
               <w:t>86</w:t>
+              <w:br/>
+            </w:r>
+            <w:r>
+              <w:rPr>
+                <w:rFonts w:ascii="Times New Roman" w:hAnsi="Times New Roman"/>
+                <w:sz w:val="18"/>
+                <w:lang w:val="en-US"/>
+              </w:rPr>
+              <w:t>(51, 121)</w:t>
             </w:r>
           </w:p>
         </w:tc>
@@ -24704,6 +24767,15 @@
                 <w:lang w:val="en-US"/>
               </w:rPr>
               <w:t>198</w:t>
+              <w:br/>
+            </w:r>
+            <w:r>
+              <w:rPr>
+                <w:rFonts w:ascii="Times New Roman" w:hAnsi="Times New Roman"/>
+                <w:sz w:val="18"/>
+                <w:lang w:val="en-US"/>
+              </w:rPr>
+              <w:t>(99, 297)</w:t>
             </w:r>
           </w:p>
         </w:tc>
@@ -24992,6 +25064,15 @@
                 <w:lang w:val="en-US"/>
               </w:rPr>
               <w:t>218</w:t>
+              <w:br/>
+            </w:r>
+            <w:r>
+              <w:rPr>
+                <w:rFonts w:ascii="Times New Roman" w:hAnsi="Times New Roman"/>
+                <w:sz w:val="18"/>
+                <w:lang w:val="en-US"/>
+              </w:rPr>
+              <w:t>(46, 390)</w:t>
             </w:r>
           </w:p>
         </w:tc>
@@ -25046,6 +25127,15 @@
                 <w:lang w:val="en-US"/>
               </w:rPr>
               <w:t>62</w:t>
+              <w:br/>
+            </w:r>
+            <w:r>
+              <w:rPr>
+                <w:rFonts w:ascii="Times New Roman" w:hAnsi="Times New Roman"/>
+                <w:sz w:val="18"/>
+                <w:lang w:val="en-US"/>
+              </w:rPr>
+              <w:t>(-73, 197)</w:t>
             </w:r>
           </w:p>
         </w:tc>
@@ -25100,6 +25190,15 @@
                 <w:lang w:val="en-US"/>
               </w:rPr>
               <w:t>71</w:t>
+              <w:br/>
+            </w:r>
+            <w:r>
+              <w:rPr>
+                <w:rFonts w:ascii="Times New Roman" w:hAnsi="Times New Roman"/>
+                <w:sz w:val="18"/>
+                <w:lang w:val="en-US"/>
+              </w:rPr>
+              <w:t>(31, 111)</w:t>
             </w:r>
           </w:p>
         </w:tc>
@@ -25154,6 +25253,15 @@
                 <w:lang w:val="en-US"/>
               </w:rPr>
               <w:t>357</w:t>
+              <w:br/>
+            </w:r>
+            <w:r>
+              <w:rPr>
+                <w:rFonts w:ascii="Times New Roman" w:hAnsi="Times New Roman"/>
+                <w:sz w:val="18"/>
+                <w:lang w:val="en-US"/>
+              </w:rPr>
+              <w:t>(233, 481)</w:t>
             </w:r>
           </w:p>
         </w:tc>
@@ -25442,6 +25550,15 @@
                 <w:lang w:val="en-US"/>
               </w:rPr>
               <w:t>1238</w:t>
+              <w:br/>
+            </w:r>
+            <w:r>
+              <w:rPr>
+                <w:rFonts w:ascii="Times New Roman" w:hAnsi="Times New Roman"/>
+                <w:sz w:val="18"/>
+                <w:lang w:val="en-US"/>
+              </w:rPr>
+              <w:t>(616, 1860)</w:t>
             </w:r>
           </w:p>
         </w:tc>
@@ -25496,6 +25613,15 @@
                 <w:lang w:val="en-US"/>
               </w:rPr>
               <w:t>303</w:t>
+              <w:br/>
+            </w:r>
+            <w:r>
+              <w:rPr>
+                <w:rFonts w:ascii="Times New Roman" w:hAnsi="Times New Roman"/>
+                <w:sz w:val="18"/>
+                <w:lang w:val="en-US"/>
+              </w:rPr>
+              <w:t>(147, 459)</w:t>
             </w:r>
           </w:p>
         </w:tc>
@@ -25550,6 +25676,15 @@
                 <w:lang w:val="en-US"/>
               </w:rPr>
               <w:t>195</w:t>
+              <w:br/>
+            </w:r>
+            <w:r>
+              <w:rPr>
+                <w:rFonts w:ascii="Times New Roman" w:hAnsi="Times New Roman"/>
+                <w:sz w:val="18"/>
+                <w:lang w:val="en-US"/>
+              </w:rPr>
+              <w:t>(141, 249)</w:t>
             </w:r>
           </w:p>
         </w:tc>
@@ -25604,6 +25739,15 @@
                 <w:lang w:val="en-US"/>
               </w:rPr>
               <w:t>463</w:t>
+              <w:br/>
+            </w:r>
+            <w:r>
+              <w:rPr>
+                <w:rFonts w:ascii="Times New Roman" w:hAnsi="Times New Roman"/>
+                <w:sz w:val="18"/>
+                <w:lang w:val="en-US"/>
+              </w:rPr>
+              <w:t>(350, 576)</w:t>
             </w:r>
           </w:p>
         </w:tc>
@@ -25910,6 +26054,15 @@
                 <w:lang w:val="en-US"/>
               </w:rPr>
               <w:t>65</w:t>
+              <w:br/>
+            </w:r>
+            <w:r>
+              <w:rPr>
+                <w:rFonts w:ascii="Times New Roman" w:hAnsi="Times New Roman"/>
+                <w:sz w:val="18"/>
+                <w:lang w:val="en-US"/>
+              </w:rPr>
+              <w:t>(-69, 199)</w:t>
             </w:r>
           </w:p>
         </w:tc>
@@ -25964,6 +26117,15 @@
                 <w:lang w:val="en-US"/>
               </w:rPr>
               <w:t>-129</w:t>
+              <w:br/>
+            </w:r>
+            <w:r>
+              <w:rPr>
+                <w:rFonts w:ascii="Times New Roman" w:hAnsi="Times New Roman"/>
+                <w:sz w:val="18"/>
+                <w:lang w:val="en-US"/>
+              </w:rPr>
+              <w:t>(-233, -25)</w:t>
             </w:r>
           </w:p>
         </w:tc>
@@ -26018,6 +26180,15 @@
                 <w:lang w:val="en-US"/>
               </w:rPr>
               <w:t>44</w:t>
+              <w:br/>
+            </w:r>
+            <w:r>
+              <w:rPr>
+                <w:rFonts w:ascii="Times New Roman" w:hAnsi="Times New Roman"/>
+                <w:sz w:val="18"/>
+                <w:lang w:val="en-US"/>
+              </w:rPr>
+              <w:t>(12, 76)</w:t>
             </w:r>
           </w:p>
         </w:tc>
@@ -26072,6 +26243,15 @@
                 <w:lang w:val="en-US"/>
               </w:rPr>
               <w:t>223</w:t>
+              <w:br/>
+            </w:r>
+            <w:r>
+              <w:rPr>
+                <w:rFonts w:ascii="Times New Roman" w:hAnsi="Times New Roman"/>
+                <w:sz w:val="18"/>
+                <w:lang w:val="en-US"/>
+              </w:rPr>
+              <w:t>(119, 327)</w:t>
             </w:r>
           </w:p>
         </w:tc>
@@ -26378,6 +26558,15 @@
                 <w:lang w:val="en-US"/>
               </w:rPr>
               <w:t>252</w:t>
+              <w:br/>
+            </w:r>
+            <w:r>
+              <w:rPr>
+                <w:rFonts w:ascii="Times New Roman" w:hAnsi="Times New Roman"/>
+                <w:sz w:val="18"/>
+                <w:lang w:val="en-US"/>
+              </w:rPr>
+              <w:t>(98, 406)</w:t>
             </w:r>
           </w:p>
         </w:tc>
@@ -26432,6 +26621,15 @@
                 <w:lang w:val="en-US"/>
               </w:rPr>
               <w:t>379</w:t>
+              <w:br/>
+            </w:r>
+            <w:r>
+              <w:rPr>
+                <w:rFonts w:ascii="Times New Roman" w:hAnsi="Times New Roman"/>
+                <w:sz w:val="18"/>
+                <w:lang w:val="en-US"/>
+              </w:rPr>
+              <w:t>(224, 534)</w:t>
             </w:r>
           </w:p>
         </w:tc>
@@ -26486,6 +26684,15 @@
                 <w:lang w:val="en-US"/>
               </w:rPr>
               <w:t>43</w:t>
+              <w:br/>
+            </w:r>
+            <w:r>
+              <w:rPr>
+                <w:rFonts w:ascii="Times New Roman" w:hAnsi="Times New Roman"/>
+                <w:sz w:val="18"/>
+                <w:lang w:val="en-US"/>
+              </w:rPr>
+              <w:t>(18, 68)</w:t>
             </w:r>
           </w:p>
         </w:tc>
@@ -26540,6 +26747,15 @@
                 <w:lang w:val="en-US"/>
               </w:rPr>
               <w:t>226</w:t>
+              <w:br/>
+            </w:r>
+            <w:r>
+              <w:rPr>
+                <w:rFonts w:ascii="Times New Roman" w:hAnsi="Times New Roman"/>
+                <w:sz w:val="18"/>
+                <w:lang w:val="en-US"/>
+              </w:rPr>
+              <w:t>(123, 329)</w:t>
             </w:r>
           </w:p>
         </w:tc>
@@ -26828,6 +27044,15 @@
                 <w:lang w:val="en-US"/>
               </w:rPr>
               <w:t>444</w:t>
+              <w:br/>
+            </w:r>
+            <w:r>
+              <w:rPr>
+                <w:rFonts w:ascii="Times New Roman" w:hAnsi="Times New Roman"/>
+                <w:sz w:val="18"/>
+                <w:lang w:val="en-US"/>
+              </w:rPr>
+              <w:t>(201, 687)</w:t>
             </w:r>
           </w:p>
         </w:tc>
@@ -26882,6 +27107,15 @@
                 <w:lang w:val="en-US"/>
               </w:rPr>
               <w:t>235</w:t>
+              <w:br/>
+            </w:r>
+            <w:r>
+              <w:rPr>
+                <w:rFonts w:ascii="Times New Roman" w:hAnsi="Times New Roman"/>
+                <w:sz w:val="18"/>
+                <w:lang w:val="en-US"/>
+              </w:rPr>
+              <w:t>(114, 356)</w:t>
             </w:r>
           </w:p>
         </w:tc>
@@ -26936,6 +27170,15 @@
                 <w:lang w:val="en-US"/>
               </w:rPr>
               <w:t>33</w:t>
+              <w:br/>
+            </w:r>
+            <w:r>
+              <w:rPr>
+                <w:rFonts w:ascii="Times New Roman" w:hAnsi="Times New Roman"/>
+                <w:sz w:val="18"/>
+                <w:lang w:val="en-US"/>
+              </w:rPr>
+              <w:t>(-2, 68)</w:t>
             </w:r>
           </w:p>
         </w:tc>
@@ -26990,6 +27233,15 @@
                 <w:lang w:val="en-US"/>
               </w:rPr>
               <w:t>1179</w:t>
+              <w:br/>
+            </w:r>
+            <w:r>
+              <w:rPr>
+                <w:rFonts w:ascii="Times New Roman" w:hAnsi="Times New Roman"/>
+                <w:sz w:val="18"/>
+                <w:lang w:val="en-US"/>
+              </w:rPr>
+              <w:t>(935, 1423)</w:t>
             </w:r>
           </w:p>
         </w:tc>
@@ -27278,6 +27530,15 @@
                 <w:lang w:val="en-US"/>
               </w:rPr>
               <w:t>345</w:t>
+              <w:br/>
+            </w:r>
+            <w:r>
+              <w:rPr>
+                <w:rFonts w:ascii="Times New Roman" w:hAnsi="Times New Roman"/>
+                <w:sz w:val="18"/>
+                <w:lang w:val="en-US"/>
+              </w:rPr>
+              <w:t>(167, 523)</w:t>
             </w:r>
           </w:p>
         </w:tc>
@@ -27332,6 +27593,15 @@
                 <w:lang w:val="en-US"/>
               </w:rPr>
               <w:t>174</w:t>
+              <w:br/>
+            </w:r>
+            <w:r>
+              <w:rPr>
+                <w:rFonts w:ascii="Times New Roman" w:hAnsi="Times New Roman"/>
+                <w:sz w:val="18"/>
+                <w:lang w:val="en-US"/>
+              </w:rPr>
+              <w:t>(53, 295)</w:t>
             </w:r>
           </w:p>
         </w:tc>
@@ -27386,6 +27656,15 @@
                 <w:lang w:val="en-US"/>
               </w:rPr>
               <w:t>34</w:t>
+              <w:br/>
+            </w:r>
+            <w:r>
+              <w:rPr>
+                <w:rFonts w:ascii="Times New Roman" w:hAnsi="Times New Roman"/>
+                <w:sz w:val="18"/>
+                <w:lang w:val="en-US"/>
+              </w:rPr>
+              <w:t>(-2, 70)</w:t>
             </w:r>
           </w:p>
         </w:tc>
@@ -27440,6 +27719,15 @@
                 <w:lang w:val="en-US"/>
               </w:rPr>
               <w:t>1002</w:t>
+              <w:br/>
+            </w:r>
+            <w:r>
+              <w:rPr>
+                <w:rFonts w:ascii="Times New Roman" w:hAnsi="Times New Roman"/>
+                <w:sz w:val="18"/>
+                <w:lang w:val="en-US"/>
+              </w:rPr>
+              <w:t>(816, 1188)</w:t>
             </w:r>
           </w:p>
         </w:tc>
@@ -28338,7 +28626,7 @@
                 <w:sz w:val="16"/>
                 <w:lang w:val="en-US"/>
               </w:rPr>
-              <w:t xml:space="preserve">***p &lt; 0.001; **p &lt; 0.01; *p &lt; 0.05. Note: Latent class logit models estimated on the pooled sample (N = 957) using the gmnl package (Sarrias &amp; Daziano, 2017); standard errors in parentheses. MWTP (marginal willingness-to-pay, SEK/month) calculated as -(coefficient/price coefficient) x 900 SEK (10% of the sample median planned monthly housing cost). Class shares are prior probabilities from the class-membership model.</w:t>
+              <w:t>***p &lt; 0.001; **p &lt; 0.01; *p &lt; 0.05. Note: Latent class logit models estimated on the pooled sample (N = 957) using the gmnl package (Sarrias &amp; Daziano, 2017); standard errors for coefficients in parentheses. MWTP (marginal willingness-to-pay, SEK/month) calculated as -(coefficient/price coefficient) x 900 SEK (10% of the sample median planned monthly housing cost); 95% CIs from the delta method, accounting for the covariance between each attribute coefficient and the price coefficient. Class shares are prior probabilities from the class-membership model.</w:t>
             </w:r>
             <w:proofErr w:type="spellStart"/>
             <w:r>

</xml_diff>